<commit_message>
Update report, add HTML output, remove gitignore
</commit_message>
<xml_diff>
--- a/XAI_Exercise5_PDP_Report.docx
+++ b/XAI_Exercise5_PDP_Report.docx
@@ -73,116 +73,46 @@
       </w:r>
     </w:p>
     <w:p>
-      <w:pPr>
-        <w:spacing w:after="1200"/>
-      </w:pPr>
-      <w:r>
-        <w:rPr>
-          <w:color w:val="555555"/>
-          <w:sz w:val="28"/>
-          <w:szCs w:val="28"/>
-        </w:rPr>
+      <w:r>
         <w:br/>
       </w:r>
       <w:r>
-        <w:rPr>
-          <w:color w:val="555555"/>
-          <w:sz w:val="28"/>
-          <w:szCs w:val="28"/>
-        </w:rPr>
         <w:br/>
       </w:r>
       <w:r>
-        <w:rPr>
-          <w:color w:val="555555"/>
-          <w:sz w:val="28"/>
-          <w:szCs w:val="28"/>
-        </w:rPr>
         <w:br/>
       </w:r>
       <w:r>
-        <w:rPr>
-          <w:color w:val="555555"/>
-          <w:sz w:val="28"/>
-          <w:szCs w:val="28"/>
-        </w:rPr>
         <w:br/>
       </w:r>
       <w:r>
-        <w:rPr>
-          <w:color w:val="555555"/>
-          <w:sz w:val="28"/>
-          <w:szCs w:val="28"/>
-        </w:rPr>
         <w:br/>
       </w:r>
       <w:r>
-        <w:rPr>
-          <w:color w:val="555555"/>
-          <w:sz w:val="28"/>
-          <w:szCs w:val="28"/>
-        </w:rPr>
         <w:br/>
       </w:r>
       <w:r>
-        <w:rPr>
-          <w:color w:val="555555"/>
-          <w:sz w:val="28"/>
-          <w:szCs w:val="28"/>
-        </w:rPr>
         <w:br/>
       </w:r>
       <w:r>
-        <w:rPr>
-          <w:color w:val="555555"/>
-          <w:sz w:val="28"/>
-          <w:szCs w:val="28"/>
-        </w:rPr>
         <w:br/>
       </w:r>
       <w:r>
-        <w:rPr>
-          <w:color w:val="555555"/>
-          <w:sz w:val="28"/>
-          <w:szCs w:val="28"/>
-        </w:rPr>
         <w:br/>
       </w:r>
       <w:r>
-        <w:rPr>
-          <w:color w:val="555555"/>
-          <w:sz w:val="28"/>
-          <w:szCs w:val="28"/>
-        </w:rPr>
         <w:br/>
       </w:r>
       <w:r>
-        <w:rPr>
-          <w:color w:val="555555"/>
-          <w:sz w:val="28"/>
-          <w:szCs w:val="28"/>
-        </w:rPr>
         <w:br/>
       </w:r>
       <w:r>
-        <w:rPr>
-          <w:color w:val="555555"/>
-          <w:sz w:val="28"/>
-          <w:szCs w:val="28"/>
-        </w:rPr>
         <w:br/>
       </w:r>
-      <w:r>
-        <w:rPr>
-          <w:sz w:val="4"/>
-          <w:szCs w:val="4"/>
-        </w:rPr>
-        <w:t xml:space="preserve"> </w:t>
-      </w:r>
-    </w:p>
-    <w:p>
-      <w:pPr>
-        <w:pStyle w:val="Ttulo3"/>
+    </w:p>
+    <w:p>
+      <w:pPr>
+        <w:ind w:left="708" w:hanging="708"/>
       </w:pPr>
       <w:r>
         <w:br/>
@@ -1388,6 +1318,7 @@
     </w:p>
     <w:p>
       <w:pPr>
+        <w:ind w:left="708" w:hanging="708"/>
         <w:rPr>
           <w:b/>
           <w:bCs/>
@@ -1450,7 +1381,13 @@
         <w:rPr>
           <w:lang w:val="en-US"/>
         </w:rPr>
-        <w:t>The PDP shows a non-linear upward trend over time. Rentals grow gradually during the first year (~days 0-365), then jump sharply around day 400 and reach a plateau between days 400-600, before dropping slightly at the very end. This reflects the seasonal growth pattern of the bike sharing system: a first year of moderate usage followed by a strong consolidation in 2012, with a slight drop at the end of the observation period possibly due to seasonal factors.</w:t>
+        <w:t>The variable instant represents the sequential day index starting from 1 January 2011, used here as a proxy for days since 2011. The PDP shows a non-linear upward trend over time</w:t>
+      </w:r>
+      <w:r>
+        <w:rPr>
+          <w:lang w:val="en-US"/>
+        </w:rPr>
+        <w:t>. Rentals grow gradually during the first year (~days 0-365), then jump sharply around day 400 and reach a plateau between days 400-600, before dropping slightly at the very end. This reflects the seasonal growth pattern of the bike sharing system: a first year of moderate usage followed by a strong consolidation in 2012, with a slight drop at the end of the observation period possibly due to seasonal factors.</w:t>
       </w:r>
     </w:p>
     <w:p>
@@ -1595,7 +1532,13 @@
         <w:rPr>
           <w:lang w:val="en-US"/>
         </w:rPr>
-        <w:t>A 2D PDP was generated combining humidity and temperature as joint predictors of bike rental counts. Due to the computational cost of evaluating all feature combinations, a random sample of 300 observations from the training set was used. The prediction surface was computed over a 50x50 grid covering the full range of both features, with all other features held at their sample means.</w:t>
+        <w:t>A 2D PDP was generated combining humidity and temperature as joint predictors of bike rental counts. Due to the computational cost of evaluating all feature combinations, a random sample of 300 observations from the training set was used.</w:t>
+      </w:r>
+      <w:r>
+        <w:rPr>
+          <w:lang w:val="en-US"/>
+        </w:rPr>
+        <w:t xml:space="preserve"> </w:t>
       </w:r>
     </w:p>
     <w:p>
@@ -1609,49 +1552,74 @@
         <w:rPr>
           <w:lang w:val="en-US"/>
         </w:rPr>
+        <w:t xml:space="preserve">Note that, given the relatively small size of the bike sharing dataset (731 daily observations), 300 samples represent approximately 41% of the total data. A larger sample or the full dataset could have been used without significant computational </w:t>
+      </w:r>
+      <w:r>
+        <w:rPr>
+          <w:lang w:val="en-US"/>
+        </w:rPr>
+        <w:lastRenderedPageBreak/>
+        <w:t>cost; the subsampling was applied conservatively for consistency with the approach used in Exercise 3.</w:t>
+      </w:r>
+      <w:r>
+        <w:rPr>
+          <w:lang w:val="en-US"/>
+        </w:rPr>
+        <w:t xml:space="preserve"> The prediction surface was computed over a 50x50 grid covering the full range of both features, with all other features held at their sample means.</w:t>
+      </w:r>
+    </w:p>
+    <w:p>
+      <w:pPr>
+        <w:spacing w:after="160"/>
+        <w:rPr>
+          <w:color w:val="2E75B6"/>
+          <w:lang w:val="en-US"/>
+        </w:rPr>
+      </w:pPr>
+      <w:r>
+        <w:rPr>
+          <w:lang w:val="en-US"/>
+        </w:rPr>
         <w:t>The density distributions of both features are shown alongside the main plot to contextualise where the data is concentrated.</w:t>
       </w:r>
-    </w:p>
-    <w:p>
-      <w:pPr>
-        <w:rPr>
-          <w:b/>
-          <w:bCs/>
+      <w:bookmarkStart w:id="6" w:name="_Toc229308467"/>
+    </w:p>
+    <w:bookmarkEnd w:id="6"/>
+    <w:p>
+      <w:pPr>
+        <w:pStyle w:val="Ttulo2"/>
+        <w:rPr>
+          <w:lang w:val="en-US"/>
+        </w:rPr>
+      </w:pPr>
+      <w:r>
+        <w:rPr>
           <w:color w:val="2E75B6"/>
-          <w:sz w:val="28"/>
-          <w:szCs w:val="28"/>
-          <w:lang w:val="en-US"/>
-        </w:rPr>
-      </w:pPr>
+          <w:lang w:val="en-US"/>
+        </w:rPr>
+        <w:t>2.</w:t>
+      </w:r>
       <w:r>
         <w:rPr>
           <w:color w:val="2E75B6"/>
           <w:lang w:val="en-US"/>
         </w:rPr>
-        <w:br w:type="page"/>
-      </w:r>
-    </w:p>
-    <w:p>
-      <w:pPr>
-        <w:pStyle w:val="Ttulo2"/>
-      </w:pPr>
-      <w:bookmarkStart w:id="6" w:name="_Toc229308467"/>
+        <w:t>2</w:t>
+      </w:r>
       <w:r>
         <w:rPr>
           <w:color w:val="2E75B6"/>
-        </w:rPr>
-        <w:lastRenderedPageBreak/>
-        <w:t xml:space="preserve">2.2    </w:t>
-      </w:r>
-      <w:proofErr w:type="spellStart"/>
+          <w:lang w:val="en-US"/>
+        </w:rPr>
+        <w:t xml:space="preserve">    </w:t>
+      </w:r>
       <w:r>
         <w:rPr>
           <w:color w:val="2E75B6"/>
+          <w:lang w:val="en-US"/>
         </w:rPr>
         <w:t>Results</w:t>
       </w:r>
-      <w:bookmarkEnd w:id="6"/>
-      <w:proofErr w:type="spellEnd"/>
     </w:p>
     <w:p>
       <w:pPr>
@@ -1818,6 +1786,7 @@
           <w:color w:val="2E75B6"/>
           <w:lang w:val="en-US"/>
         </w:rPr>
+        <w:lastRenderedPageBreak/>
         <w:t>3.1    Methodology</w:t>
       </w:r>
       <w:bookmarkEnd w:id="9"/>
@@ -1847,12 +1816,25 @@
         <w:rPr>
           <w:lang w:val="en-US"/>
         </w:rPr>
-        <w:lastRenderedPageBreak/>
         <w:t>Model performance: R² = 0.5699 on the sample. This moderate value reflects the difficulty of predicting house prices using only six structural features, excluding key factors such as location, neighbourhood quality, and renovation status.</w:t>
       </w:r>
     </w:p>
     <w:p>
       <w:pPr>
+        <w:spacing w:after="160"/>
+        <w:rPr>
+          <w:lang w:val="en-US"/>
+        </w:rPr>
+      </w:pPr>
+      <w:r>
+        <w:rPr>
+          <w:lang w:val="en-US"/>
+        </w:rPr>
+        <w:t>Additionally, restricting training to a random sample of 3,000 out of 21,613 observations may introduce additional variance in the model estimates, which could further limit predictive performance compared to training on the full dataset.</w:t>
+      </w:r>
+    </w:p>
+    <w:p>
+      <w:pPr>
         <w:pStyle w:val="Ttulo2"/>
       </w:pPr>
       <w:bookmarkStart w:id="10" w:name="_Toc229308471"/>
@@ -1860,9 +1842,17 @@
         <w:rPr>
           <w:color w:val="2E75B6"/>
         </w:rPr>
-        <w:t>3.2    Results</w:t>
+        <w:t xml:space="preserve">3.2    </w:t>
+      </w:r>
+      <w:proofErr w:type="spellStart"/>
+      <w:r>
+        <w:rPr>
+          <w:color w:val="2E75B6"/>
+        </w:rPr>
+        <w:t>Results</w:t>
       </w:r>
       <w:bookmarkEnd w:id="10"/>
+      <w:proofErr w:type="spellEnd"/>
     </w:p>
     <w:p>
       <w:pPr>
@@ -1977,7 +1967,14 @@
         <w:rPr>
           <w:lang w:val="en-US"/>
         </w:rPr>
-        <w:t>The PDP for bedrooms shows a clear and consistently negative relationship. Predicted price starts at its maximum (~$595k) for houses with 1-2 bedrooms and decreases steadily as the number of bedrooms increases, stabilising at around $520k for 5+ bedrooms. This is counterintuitive but reflects the fact that, when controlling for other features like living area, adding bedrooms means smaller individual rooms. Compact high-quality properties with few bedrooms tend to command higher prices than larger but less refined ones.</w:t>
+        <w:t xml:space="preserve">The PDP for bedrooms shows a clear and consistently negative relationship. Predicted price starts at its maximum (~$595k) for houses with 1-2 bedrooms and decreases steadily as the number of bedrooms increases, stabilising at around $520k for 5+ bedrooms. This is counterintuitive but reflects the fact that, when controlling for other features like living area, adding bedrooms means smaller </w:t>
+      </w:r>
+      <w:r>
+        <w:rPr>
+          <w:lang w:val="en-US"/>
+        </w:rPr>
+        <w:lastRenderedPageBreak/>
+        <w:t>individual rooms. Compact high-quality properties with few bedrooms tend to command higher prices than larger but less refined ones.</w:t>
       </w:r>
     </w:p>
     <w:p>
@@ -2255,6 +2252,7 @@
         <w:docPartUnique/>
       </w:docPartObj>
     </w:sdtPr>
+    <w:sdtEndPr/>
     <w:sdtContent>
       <w:p>
         <w:pPr>
@@ -2342,6 +2340,7 @@
                                     </w:rPr>
                                     <w:id w:val="-1904517296"/>
                                   </w:sdtPr>
+                                  <w:sdtEndPr/>
                                   <w:sdtContent>
                                     <w:p>
                                       <w:pPr>
@@ -4567,7 +4566,6 @@
   <w:style w:type="character" w:default="1" w:styleId="Fuentedeprrafopredeter">
     <w:name w:val="Default Paragraph Font"/>
     <w:uiPriority w:val="1"/>
-    <w:semiHidden/>
     <w:unhideWhenUsed/>
   </w:style>
   <w:style w:type="table" w:default="1" w:styleId="Tablanormal">

</xml_diff>